<commit_message>
docs: record the pushed research branch in the P2 plan
Co-Authored-By: Claude Code <noreply@anthropic.com>
</commit_message>
<xml_diff>
--- a/docs/RESULTS.docx
+++ b/docs/RESULTS.docx
@@ -14317,7 +14317,7 @@
     </w:p>
     <w:bookmarkEnd w:id="33"/>
     <w:bookmarkEnd w:id="34"/>
-    <w:bookmarkStart w:id="64" w:name="附录"/>
+    <w:bookmarkStart w:id="65" w:name="附录"/>
     <w:p>
       <w:pPr>
         <w:pStyle w:val="Heading1"/>
@@ -24194,7 +24194,7 @@
     </w:p>
     <w:bookmarkEnd w:id="49"/>
     <w:bookmarkEnd w:id="50"/>
-    <w:bookmarkStart w:id="63" w:name="p2-执行计划2026-10-23有卡后按此执行"/>
+    <w:bookmarkStart w:id="64" w:name="p2-执行计划2026-10-23有卡后按此执行"/>
     <w:p>
       <w:pPr>
         <w:pStyle w:val="Heading2"/>
@@ -26637,7 +26637,7 @@
       </w:r>
     </w:p>
     <w:bookmarkEnd w:id="55"/>
-    <w:bookmarkStart w:id="62" w:name="参考"/>
+    <w:bookmarkStart w:id="63" w:name="参考"/>
     <w:p>
       <w:pPr>
         <w:pStyle w:val="Heading3"/>
@@ -26784,7 +26784,7 @@
         <w:rPr>
           <w:rFonts w:hint="eastAsia"/>
         </w:rPr>
-        <w:t xml:space="preserve">当前本地分支：</w:t>
+        <w:t xml:space="preserve">当前分支：</w:t>
       </w:r>
       <w:r>
         <w:rPr>
@@ -26811,16 +26811,31 @@
         <w:rPr>
           <w:rFonts w:hint="eastAsia"/>
         </w:rPr>
-        <w:t xml:space="preserve">，未</w:t>
-      </w:r>
-      <w:r>
-        <w:t xml:space="preserve"> </w:t>
-      </w:r>
-      <w:r>
-        <w:rPr>
-          <w:rFonts w:hint="eastAsia"/>
-        </w:rPr>
-        <w:t xml:space="preserve">commit/push）；测试</w:t>
+        <w:t xml:space="preserve">，已提交并推送到</w:t>
+      </w:r>
+      <w:r>
+        <w:t xml:space="preserve"> </w:t>
+      </w:r>
+      <w:r>
+        <w:rPr>
+          <w:rFonts w:hint="eastAsia"/>
+        </w:rPr>
+        <w:t xml:space="preserve">origin，commit</w:t>
+      </w:r>
+      <w:r>
+        <w:t xml:space="preserve"> </w:t>
+      </w:r>
+      <w:r>
+        <w:rPr>
+          <w:rStyle w:val="VerbatimChar"/>
+        </w:rPr>
+        <w:t xml:space="preserve">faccb23</w:t>
+      </w:r>
+      <w:r>
+        <w:rPr>
+          <w:rFonts w:hint="eastAsia"/>
+        </w:rPr>
+        <w:t xml:space="preserve">）；测试</w:t>
       </w:r>
       <w:r>
         <w:t xml:space="preserve"> </w:t>
@@ -26833,12 +26848,26 @@
         <w:t xml:space="preserve">49 passed</w:t>
       </w:r>
       <w:r>
-        <w:t xml:space="preserve">。</w:t>
-      </w:r>
+        <w:t xml:space="preserve">。GitHub </w:t>
+      </w:r>
+      <w:r>
+        <w:rPr>
+          <w:rFonts w:hint="eastAsia"/>
+        </w:rPr>
+        <w:t xml:space="preserve">分支：</w:t>
+      </w:r>
+      <w:hyperlink r:id="rId62">
+        <w:r>
+          <w:rPr>
+            <w:rStyle w:val="Hyperlink"/>
+          </w:rPr>
+          <w:t xml:space="preserve">https://github.com/LinKX-known/pathstruct-24g/tree/research/topology-diagnostics</w:t>
+        </w:r>
+      </w:hyperlink>
     </w:p>
-    <w:bookmarkEnd w:id="62"/>
     <w:bookmarkEnd w:id="63"/>
     <w:bookmarkEnd w:id="64"/>
+    <w:bookmarkEnd w:id="65"/>
     <w:sectPr>
       <w:footnotePr>
         <w:numRestart w:val="eachSect"/>

</xml_diff>